<commit_message>
Proctor Guide: cannibalize rule, warnings, end-of-game export
Co-Authored-By: Claude Opus 5.5 <noreply@anthropic.com>
Claude-Session: https://claude.ai/code/session_01JsXR6TGhWtuxw66gtWpfpZ
</commit_message>
<xml_diff>
--- a/guides/Island_Spoke_Proctor_Guide.docx
+++ b/guides/Island_Spoke_Proctor_Guide.docx
@@ -261,7 +261,7 @@
                 <w:sz w:val="20"/>
                 <w:szCs w:val="20"/>
               </w:rPr>
-              <w:t xml:space="preserve">Scan with a phone or open on a laptop. Press Reset game before 0920.</w:t>
+              <w:t xml:space="preserve">Scan with a phone or open on a laptop. No sign-in needed. Press Reset game before 0920. If the calculator blocks something, a red message appears at the bottom of the screen.</w:t>
             </w:r>
           </w:p>
           <w:p>
@@ -2061,7 +2061,7 @@
                 <w:sz w:val="20"/>
                 <w:szCs w:val="20"/>
               </w:rPr>
-              <w:t xml:space="preserve">ENDEX. Export the spreadsheet.</w:t>
+              <w:t xml:space="preserve">ENDEX. Press Copy summary (or Export) and send it to the Activity Lead.</w:t>
             </w:r>
           </w:p>
         </w:tc>
@@ -4655,7 +4655,7 @@
                 <w:sz w:val="20"/>
                 <w:szCs w:val="20"/>
               </w:rPr>
-              <w:t xml:space="preserve">Strip 1 Down jet for good to fix another of the same type</w:t>
+              <w:t xml:space="preserve">Needs 2 Down jets of the same type. One is stripped for parts and is Out for good, the other is fixed. Not possible on Day 1.</w:t>
             </w:r>
           </w:p>
         </w:tc>

</xml_diff>

<commit_message>
Add GMC Daily Worksheets; move forms out of the POC guides
Co-Authored-By: Claude Opus 5.5 <noreply@anthropic.com>
Claude-Session: https://claude.ai/code/session_01JsXR6TGhWtuxw66gtWpfpZ
</commit_message>
<xml_diff>
--- a/guides/Island_Spoke_Proctor_Guide.docx
+++ b/guides/Island_Spoke_Proctor_Guide.docx
@@ -679,7 +679,7 @@
                 <w:sz w:val="20"/>
                 <w:szCs w:val="20"/>
               </w:rPr>
-              <w:t xml:space="preserve">Hand out GMC Guides, Aircraft Cards, Day 1 Orders.</w:t>
+              <w:t xml:space="preserve">Hand out GMC Guides, Aircraft Cards, Day 1 Orders and Worksheet.</w:t>
             </w:r>
           </w:p>
         </w:tc>
@@ -1115,7 +1115,7 @@
                 <w:sz w:val="20"/>
                 <w:szCs w:val="20"/>
               </w:rPr>
-              <w:t xml:space="preserve">Hand out Day 2 Orders.</w:t>
+              <w:t xml:space="preserve">Hand out Day 2 Orders and Worksheet.</w:t>
             </w:r>
           </w:p>
         </w:tc>
@@ -1442,7 +1442,7 @@
                 <w:sz w:val="20"/>
                 <w:szCs w:val="20"/>
               </w:rPr>
-              <w:t xml:space="preserve">Hand out Day 3 Orders.</w:t>
+              <w:t xml:space="preserve">Hand out Day 3 Orders and Worksheet.</w:t>
             </w:r>
           </w:p>
         </w:tc>
@@ -1769,7 +1769,7 @@
                 <w:sz w:val="20"/>
                 <w:szCs w:val="20"/>
               </w:rPr>
-              <w:t xml:space="preserve">Hand out Day 4 Orders.</w:t>
+              <w:t xml:space="preserve">Hand out Day 4 Orders and Worksheet.</w:t>
             </w:r>
           </w:p>
         </w:tc>
@@ -4922,7 +4922,7 @@
           <w:sz w:val="22"/>
           <w:szCs w:val="22"/>
         </w:rPr>
-        <w:t xml:space="preserve">Check the room: tables for 14 and a wall for the board.</w:t>
+        <w:t xml:space="preserve">Check the room: tables for 14.</w:t>
       </w:r>
     </w:p>
     <w:p>
@@ -4940,7 +4940,7 @@
           <w:sz w:val="22"/>
           <w:szCs w:val="22"/>
         </w:rPr>
-        <w:t xml:space="preserve">Tape up the Availability Board (11x17). The Day 1 block is pre-filled.</w:t>
+        <w:t xml:space="preserve">Stack the Day 1-4 Orders and the Day 1-4 Worksheets in order. Each day's Worksheet goes out with that day's Orders.</w:t>
       </w:r>
     </w:p>
     <w:p>
@@ -4958,7 +4958,7 @@
           <w:sz w:val="22"/>
           <w:szCs w:val="22"/>
         </w:rPr>
-        <w:t xml:space="preserve">At seats: 14 GMC Guides, Aircraft Reference Cards, Phase Sheets, pencils.</w:t>
+        <w:t xml:space="preserve">At seats: 14 GMC Guides, Aircraft Reference Cards, pencils.</w:t>
       </w:r>
     </w:p>
     <w:p>
@@ -8574,7 +8574,7 @@
                 <w:sz w:val="20"/>
                 <w:szCs w:val="20"/>
               </w:rPr>
-              <w:t xml:space="preserve">Remove every note, Phase Sheet, and the Day 1 and Day 2 Orders. Cover the Availability Board.</w:t>
+              <w:t xml:space="preserve">Remove every note and the Day 1 and Day 2 Orders and Worksheets.</w:t>
             </w:r>
           </w:p>
         </w:tc>
@@ -8792,7 +8792,7 @@
                 <w:sz w:val="20"/>
                 <w:szCs w:val="20"/>
               </w:rPr>
-              <w:t xml:space="preserve">Hand out Day 3 Orders.</w:t>
+              <w:t xml:space="preserve">Hand out Day 3 Orders and Worksheet.</w:t>
             </w:r>
           </w:p>
         </w:tc>
@@ -8864,7 +8864,7 @@
                 <w:sz w:val="22"/>
                 <w:szCs w:val="22"/>
               </w:rPr>
-              <w:t xml:space="preserve">Maintenance rebuilds the board by asking you about one aircraft type at a time. Answer each truthfully from the calculator's Fleet panel. Lead #1 rejoins Ops after their debrief.</w:t>
+              <w:t xml:space="preserve">Maintenance rebuilds the Day 3 Worksheet board by asking you about one aircraft type at a time. Answer each truthfully from the calculator's Fleet panel. Lead #1 rejoins Ops after their debrief.</w:t>
             </w:r>
           </w:p>
         </w:tc>
@@ -10289,7 +10289,7 @@
           <w:sz w:val="22"/>
           <w:szCs w:val="22"/>
         </w:rPr>
-        <w:t xml:space="preserve">read the board day by day. What happened?</w:t>
+        <w:t xml:space="preserve">read each day's Worksheet in order. What happened?</w:t>
       </w:r>
     </w:p>
     <w:p>

</xml_diff>

<commit_message>
Leads are pre-assigned; keep guides in guides/
Co-Authored-By: Claude Opus 5.5 <noreply@anthropic.com>
Claude-Session: https://claude.ai/code/session_01JsXR6TGhWtuxw66gtWpfpZ
</commit_message>
<xml_diff>
--- a/guides/Island_Spoke_Proctor_Guide.docx
+++ b/guides/Island_Spoke_Proctor_Guide.docx
@@ -1100,7 +1100,7 @@
                 <w:sz w:val="20"/>
                 <w:szCs w:val="20"/>
               </w:rPr>
-              <w:t xml:space="preserve">Read the scenario. Name GLP Lead #1. Give Maintenance the start status.</w:t>
+              <w:t xml:space="preserve">Read the scenario. GLP Lead #1 (pre-assigned) takes command. Give Maintenance the start status.</w:t>
             </w:r>
           </w:p>
         </w:tc>
@@ -1135,7 +1135,7 @@
                 <w:sz w:val="20"/>
                 <w:szCs w:val="20"/>
               </w:rPr>
-              <w:t xml:space="preserve">Hand out Day 1 papers.</w:t>
+              <w:t xml:space="preserve">Hand out GMC Guides, Aircraft Cards, Day 1 Orders, Day 1 Worksheet.</w:t>
             </w:r>
           </w:p>
         </w:tc>
@@ -1711,7 +1711,7 @@
                 <w:sz w:val="20"/>
                 <w:szCs w:val="20"/>
               </w:rPr>
-              <w:t xml:space="preserve">Hand out Day 2 papers.</w:t>
+              <w:t xml:space="preserve">Hand out Day 2 Orders and Day 2 Worksheet.</w:t>
             </w:r>
           </w:p>
         </w:tc>
@@ -1964,7 +1964,7 @@
                 <w:sz w:val="20"/>
                 <w:szCs w:val="20"/>
               </w:rPr>
-              <w:t xml:space="preserve">Read the inject. Name GLP Lead #2. Give the Bunker Card.</w:t>
+              <w:t xml:space="preserve">Read the inject. GLP Lead #2 (pre-assigned) takes command. Give the Bunker Card.</w:t>
             </w:r>
           </w:p>
         </w:tc>
@@ -2143,7 +2143,7 @@
                 <w:sz w:val="20"/>
                 <w:szCs w:val="20"/>
               </w:rPr>
-              <w:t xml:space="preserve">Hand out Day 3 papers.</w:t>
+              <w:t xml:space="preserve">Hand out Day 3 Orders and Day 3 Worksheet.</w:t>
             </w:r>
           </w:p>
         </w:tc>
@@ -2575,7 +2575,7 @@
                 <w:sz w:val="20"/>
                 <w:szCs w:val="20"/>
               </w:rPr>
-              <w:t xml:space="preserve">Hand out Day 4 papers.</w:t>
+              <w:t xml:space="preserve">Hand out Day 4 Orders and Day 4 Worksheet.</w:t>
             </w:r>
           </w:p>
         </w:tc>
@@ -3838,7 +3838,7 @@
           <w:sz w:val="18"/>
           <w:szCs w:val="18"/>
         </w:rPr>
-        <w:t xml:space="preserve">Hand out orders. Do not read them aloud. Read only what is below.</w:t>
+        <w:t xml:space="preserve">Each day starts with that day’s Orders and Worksheet: Day 2 Orders at 0940, Day 3 Orders at 1005, Day 4 Orders at 1025. Never hand out a day early. Hand out orders, do not read them aloud. Read only what is below.</w:t>
       </w:r>
     </w:p>
     <w:p>
@@ -3892,7 +3892,7 @@
           <w:sz w:val="22"/>
           <w:szCs w:val="22"/>
         </w:rPr>
-        <w:t xml:space="preserve">name Lead #1 (BCL only). Tell Maintenance: "11 of 14 Ready. One F-35A, one F-15EX, and one F-16 are Down." </w:t>
+        <w:t xml:space="preserve">GLP Lead #1 is pre-assigned; confirm they are in the room. Tell Maintenance: "11 of 14 Ready. One F-35A, one F-15EX, and one F-16 are Down." </w:t>
       </w:r>
       <w:r>
         <w:rPr>
@@ -4071,7 +4071,7 @@
           <w:sz w:val="22"/>
           <w:szCs w:val="22"/>
         </w:rPr>
-        <w:t xml:space="preserve">Name Lead #2 (BCL only). Hand them only the Bunker Card: "14 jets assigned. Status unknown. 14 Wing Points per day."</w:t>
+        <w:t xml:space="preserve">GLP Lead #2 (pre-assigned) takes command. Hand them only the Bunker Card: "14 jets assigned. Status unknown. 14 Wing Points per day."</w:t>
       </w:r>
     </w:p>
     <w:p>

</xml_diff>